<commit_message>
Fix Etapa 5: app WES con hora Chile + hueco placa 22/09
El total app salía bajo (65,8) porque la API truncó el 22/09 tras el
cambio de placa y no se convertía UTC→Chile. Con el criterio del
informe original: App 85,50 > Sensus 81 → error 5,3%.

Co-authored-by: anibaloperacionesWes <anibaloperacionesWes@users.noreply.github.com>
</commit_message>
<xml_diff>
--- a/reports/Fundo_Zapallar/Informes_Tecnicos/validacion_22_28_out/Informe_Validacion_Etapa5_Zapallar_20260924_1136.docx
+++ b/reports/Fundo_Zapallar/Informes_Tecnicos/validacion_22_28_out/Informe_Validacion_Etapa5_Zapallar_20260924_1136.docx
@@ -408,7 +408,7 @@
                 <w:color w:val="1B5E20"/>
                 <w:sz w:val="24"/>
               </w:rPr>
-              <w:t>Error 18.8 %</w:t>
+              <w:t>Error 5.3 %</w:t>
               <w:br/>
             </w:r>
             <w:r>
@@ -418,7 +418,7 @@
                 <w:color w:val="646E78"/>
                 <w:sz w:val="16"/>
               </w:rPr>
-              <w:t>81 / 65,80 m³</w:t>
+              <w:t>81 / 85,50 m³</w:t>
             </w:r>
           </w:p>
         </w:tc>
@@ -831,7 +831,7 @@
           <w:color w:val="282828"/>
           <w:sz w:val="21"/>
         </w:rPr>
-        <w:t>Se detectaron pulsos anómalos; el error era de memoria de placa. Se reemplazó la memoria y se normalizó el punto. Validación única 22–28/09: Sensus 81 m³ vs app 65,80 m³ (error 18.8%, revisar — diferencia relevante).</w:t>
+        <w:t>Se detectaron pulsos anómalos; el error era de memoria de placa. Se reemplazó la memoria y se normalizó el punto. Validación única 22–28/09: Sensus 81 m³ vs app 85,50 m³ (error 5.3%, aceptable (diferencia moderada)).</w:t>
       </w:r>
     </w:p>
     <w:p>
@@ -1978,7 +1978,7 @@
                 <w:color w:val="1B5E20"/>
                 <w:sz w:val="24"/>
               </w:rPr>
-              <w:t>Error 18.8 %</w:t>
+              <w:t>Error 5.3 %</w:t>
               <w:br/>
             </w:r>
             <w:r>
@@ -1988,7 +1988,7 @@
                 <w:color w:val="646E78"/>
                 <w:sz w:val="16"/>
               </w:rPr>
-              <w:t>81 / 65,80 m³</w:t>
+              <w:t>81 / 85,50 m³</w:t>
             </w:r>
           </w:p>
         </w:tc>
@@ -2063,7 +2063,7 @@
           <w:color w:val="282828"/>
           <w:sz w:val="21"/>
         </w:rPr>
-        <w:t>Una sola validación con lecturas fotográficas Sensus y el consumo de la app WES (hora 14 del 22-09 → hora 08 del 28-09). Incluye el día de intervención de placa.</w:t>
+        <w:t>Una sola validación con lecturas fotográficas Sensus y el consumo de la app WES (hora Chile 14 del 22-09 → hora 08 del 28-09). El 22/09 la API quedó truncada tras el cambio de placa: esas horas se completan con el registro de placa (mismo criterio del informe original). App WES resulta mayor que el Δ Sensus.</w:t>
       </w:r>
     </w:p>
     <w:tbl>
@@ -2593,7 +2593,7 @@
                 <w:color w:val="282828"/>
                 <w:sz w:val="20"/>
               </w:rPr>
-              <w:t>65,80 m³</w:t>
+              <w:t>85,50 m³</w:t>
             </w:r>
           </w:p>
         </w:tc>
@@ -2665,7 +2665,7 @@
                 <w:color w:val="1B5E20"/>
                 <w:sz w:val="20"/>
               </w:rPr>
-              <w:t>18.8 %</w:t>
+              <w:t>5.3 %</w:t>
             </w:r>
           </w:p>
         </w:tc>
@@ -2680,7 +2680,7 @@
           <w:color w:val="282828"/>
           <w:sz w:val="21"/>
         </w:rPr>
-        <w:t>Error Sensus vs app: 18.8% (1 − 65,80/81,00). Revisar — diferencia relevante.</w:t>
+        <w:t>Error Sensus vs app: 5.3% (1 − 81/85,50). Aceptable (diferencia moderada).</w:t>
       </w:r>
     </w:p>
     <w:p>
@@ -2705,7 +2705,7 @@
           <w:color w:val="282828"/>
           <w:sz w:val="21"/>
         </w:rPr>
-        <w:t>Se confirma falla de memoria de placa (sensor y voltajes OK). Validación única 22–28/09: Sensus 81 m³ vs app 65,80 m³ (error 18.8%, Revisar — diferencia relevante). El agente IA revisará diariamente el caudal vs histórico y techo DN90 (60 m³/h).</w:t>
+        <w:t>Se confirma falla de memoria de placa (sensor y voltajes OK). Validación única 22–28/09: Sensus 81 m³ vs app 85,50 m³ (error 5.3%, Aceptable (diferencia moderada)). El agente IA revisará diariamente el caudal vs histórico y techo DN90 (60 m³/h).</w:t>
       </w:r>
     </w:p>
     <w:p>
@@ -2719,7 +2719,7 @@
           <w:color w:val="646E78"/>
           <w:sz w:val="18"/>
         </w:rPr>
-        <w:t>WES · Informe final · Fundo Zapallar · 28-09-2026 18:47</w:t>
+        <w:t>WES · Informe final · Fundo Zapallar · 28-09-2026 18:55</w:t>
       </w:r>
     </w:p>
     <w:sectPr>

</xml_diff>

<commit_message>
Etapa 5: app con listado horario 22/09 14→23 + TIME etiqueta
Usa el listado de placa del 22-09 (0,60…0,90) para el hueco de la
API y el CSV TIME etiqueta desde el 23/09. App 78,10 vs Sensus 81
→ error 3,6%. Incluye tabla del listado en el informe.

Co-authored-by: anibaloperacionesWes <anibaloperacionesWes@users.noreply.github.com>
</commit_message>
<xml_diff>
--- a/reports/Fundo_Zapallar/Informes_Tecnicos/validacion_22_28_out/Informe_Validacion_Etapa5_Zapallar_20260924_1136.docx
+++ b/reports/Fundo_Zapallar/Informes_Tecnicos/validacion_22_28_out/Informe_Validacion_Etapa5_Zapallar_20260924_1136.docx
@@ -408,7 +408,7 @@
                 <w:color w:val="1B5E20"/>
                 <w:sz w:val="24"/>
               </w:rPr>
-              <w:t>Error 5.3 %</w:t>
+              <w:t>Error 3.6 %</w:t>
               <w:br/>
             </w:r>
             <w:r>
@@ -418,7 +418,7 @@
                 <w:color w:val="646E78"/>
                 <w:sz w:val="16"/>
               </w:rPr>
-              <w:t>81 / 85,50 m³</w:t>
+              <w:t>81 / 78,10 m³</w:t>
             </w:r>
           </w:p>
         </w:tc>
@@ -831,7 +831,7 @@
           <w:color w:val="282828"/>
           <w:sz w:val="21"/>
         </w:rPr>
-        <w:t>Se detectaron pulsos anómalos; el error era de memoria de placa. Se reemplazó la memoria y se normalizó el punto. Validación única 22–28/09: Sensus 81 m³ vs app 85,50 m³ (error 5.3%, aceptable (diferencia moderada)).</w:t>
+        <w:t>Se detectaron pulsos anómalos; el error era de memoria de placa. Se reemplazó la memoria y se normalizó el punto. Validación única 22–28/09: Sensus 81 m³ vs app 78,10 m³ (error 3.6%, aceptable).</w:t>
       </w:r>
     </w:p>
     <w:p>
@@ -1978,7 +1978,7 @@
                 <w:color w:val="1B5E20"/>
                 <w:sz w:val="24"/>
               </w:rPr>
-              <w:t>Error 5.3 %</w:t>
+              <w:t>Error 3.6 %</w:t>
               <w:br/>
             </w:r>
             <w:r>
@@ -1988,7 +1988,7 @@
                 <w:color w:val="646E78"/>
                 <w:sz w:val="16"/>
               </w:rPr>
-              <w:t>81 / 85,50 m³</w:t>
+              <w:t>81 / 78,10 m³</w:t>
             </w:r>
           </w:p>
         </w:tc>
@@ -2063,7 +2063,461 @@
           <w:color w:val="282828"/>
           <w:sz w:val="21"/>
         </w:rPr>
-        <w:t>Una sola validación con lecturas fotográficas Sensus y el consumo de la app WES (hora Chile 14 del 22-09 → hora 08 del 28-09). El 22/09 la API quedó truncada tras el cambio de placa: esas horas se completan con el registro de placa (mismo criterio del informe original). App WES resulta mayor que el Δ Sensus.</w:t>
+        <w:t>Una sola validación con lecturas fotográficas Sensus y el consumo app WES (hora 14 del 22-09 → hora 08 del 28-09). El 22/09 14:00–23:00 se toma del listado horario de placa (API truncada tras cambio de memoria); del 23/09 en adelante, CSV TIME etiqueta.</w:t>
+      </w:r>
+    </w:p>
+    <w:p>
+      <w:r>
+        <w:rPr>
+          <w:rFonts w:ascii="Calibri" w:hAnsi="Calibri" w:eastAsia="Calibri"/>
+          <w:b/>
+          <w:color w:val="1F4788"/>
+          <w:sz w:val="20"/>
+        </w:rPr>
+        <w:t>Listado horario 22-09-2026 (14:00 → 23:00) — placa</w:t>
+      </w:r>
+    </w:p>
+    <w:tbl>
+      <w:tblPr>
+        <w:tblW w:type="auto" w:w="0"/>
+        <w:jc w:val="center"/>
+        <w:tblLook w:firstColumn="1" w:firstRow="1" w:lastColumn="0" w:lastRow="0" w:noHBand="0" w:noVBand="1" w:val="04A0"/>
+        <w:tblBorders>
+          <w:top w:val="single" w:sz="4" w:space="0" w:color="D0D5DD"/>
+          <w:left w:val="single" w:sz="4" w:space="0" w:color="D0D5DD"/>
+          <w:bottom w:val="single" w:sz="4" w:space="0" w:color="D0D5DD"/>
+          <w:right w:val="single" w:sz="4" w:space="0" w:color="D0D5DD"/>
+          <w:insideH w:val="single" w:sz="4" w:space="0" w:color="D0D5DD"/>
+          <w:insideV w:val="single" w:sz="4" w:space="0" w:color="D0D5DD"/>
+        </w:tblBorders>
+      </w:tblPr>
+      <w:tblGrid>
+        <w:gridCol w:w="1020"/>
+        <w:gridCol w:w="1020"/>
+        <w:gridCol w:w="1020"/>
+        <w:gridCol w:w="1020"/>
+        <w:gridCol w:w="1020"/>
+        <w:gridCol w:w="1020"/>
+        <w:gridCol w:w="1020"/>
+        <w:gridCol w:w="1020"/>
+        <w:gridCol w:w="1020"/>
+        <w:gridCol w:w="1020"/>
+      </w:tblGrid>
+      <w:tr>
+        <w:tc>
+          <w:tcPr>
+            <w:tcW w:type="dxa" w:w="1020"/>
+            <w:shd w:fill="1F4788" w:val="clear" w:color="auto"/>
+          </w:tcPr>
+          <w:p>
+            <w:pPr>
+              <w:jc w:val="center"/>
+            </w:pPr>
+            <w:r>
+              <w:rPr>
+                <w:rFonts w:ascii="Calibri" w:hAnsi="Calibri" w:eastAsia="Calibri"/>
+                <w:b/>
+                <w:color w:val="FFFFFF"/>
+                <w:sz w:val="16"/>
+              </w:rPr>
+              <w:t>14:00</w:t>
+            </w:r>
+          </w:p>
+        </w:tc>
+        <w:tc>
+          <w:tcPr>
+            <w:tcW w:type="dxa" w:w="1020"/>
+            <w:shd w:fill="1F4788" w:val="clear" w:color="auto"/>
+          </w:tcPr>
+          <w:p>
+            <w:pPr>
+              <w:jc w:val="center"/>
+            </w:pPr>
+            <w:r>
+              <w:rPr>
+                <w:rFonts w:ascii="Calibri" w:hAnsi="Calibri" w:eastAsia="Calibri"/>
+                <w:b/>
+                <w:color w:val="FFFFFF"/>
+                <w:sz w:val="16"/>
+              </w:rPr>
+              <w:t>15:00</w:t>
+            </w:r>
+          </w:p>
+        </w:tc>
+        <w:tc>
+          <w:tcPr>
+            <w:tcW w:type="dxa" w:w="1020"/>
+            <w:shd w:fill="1F4788" w:val="clear" w:color="auto"/>
+          </w:tcPr>
+          <w:p>
+            <w:pPr>
+              <w:jc w:val="center"/>
+            </w:pPr>
+            <w:r>
+              <w:rPr>
+                <w:rFonts w:ascii="Calibri" w:hAnsi="Calibri" w:eastAsia="Calibri"/>
+                <w:b/>
+                <w:color w:val="FFFFFF"/>
+                <w:sz w:val="16"/>
+              </w:rPr>
+              <w:t>16:00</w:t>
+            </w:r>
+          </w:p>
+        </w:tc>
+        <w:tc>
+          <w:tcPr>
+            <w:tcW w:type="dxa" w:w="1020"/>
+            <w:shd w:fill="1F4788" w:val="clear" w:color="auto"/>
+          </w:tcPr>
+          <w:p>
+            <w:pPr>
+              <w:jc w:val="center"/>
+            </w:pPr>
+            <w:r>
+              <w:rPr>
+                <w:rFonts w:ascii="Calibri" w:hAnsi="Calibri" w:eastAsia="Calibri"/>
+                <w:b/>
+                <w:color w:val="FFFFFF"/>
+                <w:sz w:val="16"/>
+              </w:rPr>
+              <w:t>17:00</w:t>
+            </w:r>
+          </w:p>
+        </w:tc>
+        <w:tc>
+          <w:tcPr>
+            <w:tcW w:type="dxa" w:w="1020"/>
+            <w:shd w:fill="1F4788" w:val="clear" w:color="auto"/>
+          </w:tcPr>
+          <w:p>
+            <w:pPr>
+              <w:jc w:val="center"/>
+            </w:pPr>
+            <w:r>
+              <w:rPr>
+                <w:rFonts w:ascii="Calibri" w:hAnsi="Calibri" w:eastAsia="Calibri"/>
+                <w:b/>
+                <w:color w:val="FFFFFF"/>
+                <w:sz w:val="16"/>
+              </w:rPr>
+              <w:t>18:00</w:t>
+            </w:r>
+          </w:p>
+        </w:tc>
+        <w:tc>
+          <w:tcPr>
+            <w:tcW w:type="dxa" w:w="1020"/>
+            <w:shd w:fill="1F4788" w:val="clear" w:color="auto"/>
+          </w:tcPr>
+          <w:p>
+            <w:pPr>
+              <w:jc w:val="center"/>
+            </w:pPr>
+            <w:r>
+              <w:rPr>
+                <w:rFonts w:ascii="Calibri" w:hAnsi="Calibri" w:eastAsia="Calibri"/>
+                <w:b/>
+                <w:color w:val="FFFFFF"/>
+                <w:sz w:val="16"/>
+              </w:rPr>
+              <w:t>19:00</w:t>
+            </w:r>
+          </w:p>
+        </w:tc>
+        <w:tc>
+          <w:tcPr>
+            <w:tcW w:type="dxa" w:w="1020"/>
+            <w:shd w:fill="1F4788" w:val="clear" w:color="auto"/>
+          </w:tcPr>
+          <w:p>
+            <w:pPr>
+              <w:jc w:val="center"/>
+            </w:pPr>
+            <w:r>
+              <w:rPr>
+                <w:rFonts w:ascii="Calibri" w:hAnsi="Calibri" w:eastAsia="Calibri"/>
+                <w:b/>
+                <w:color w:val="FFFFFF"/>
+                <w:sz w:val="16"/>
+              </w:rPr>
+              <w:t>20:00</w:t>
+            </w:r>
+          </w:p>
+        </w:tc>
+        <w:tc>
+          <w:tcPr>
+            <w:tcW w:type="dxa" w:w="1020"/>
+            <w:shd w:fill="1F4788" w:val="clear" w:color="auto"/>
+          </w:tcPr>
+          <w:p>
+            <w:pPr>
+              <w:jc w:val="center"/>
+            </w:pPr>
+            <w:r>
+              <w:rPr>
+                <w:rFonts w:ascii="Calibri" w:hAnsi="Calibri" w:eastAsia="Calibri"/>
+                <w:b/>
+                <w:color w:val="FFFFFF"/>
+                <w:sz w:val="16"/>
+              </w:rPr>
+              <w:t>21:00</w:t>
+            </w:r>
+          </w:p>
+        </w:tc>
+        <w:tc>
+          <w:tcPr>
+            <w:tcW w:type="dxa" w:w="1020"/>
+            <w:shd w:fill="1F4788" w:val="clear" w:color="auto"/>
+          </w:tcPr>
+          <w:p>
+            <w:pPr>
+              <w:jc w:val="center"/>
+            </w:pPr>
+            <w:r>
+              <w:rPr>
+                <w:rFonts w:ascii="Calibri" w:hAnsi="Calibri" w:eastAsia="Calibri"/>
+                <w:b/>
+                <w:color w:val="FFFFFF"/>
+                <w:sz w:val="16"/>
+              </w:rPr>
+              <w:t>22:00</w:t>
+            </w:r>
+          </w:p>
+        </w:tc>
+        <w:tc>
+          <w:tcPr>
+            <w:tcW w:type="dxa" w:w="1020"/>
+            <w:shd w:fill="1F4788" w:val="clear" w:color="auto"/>
+          </w:tcPr>
+          <w:p>
+            <w:pPr>
+              <w:jc w:val="center"/>
+            </w:pPr>
+            <w:r>
+              <w:rPr>
+                <w:rFonts w:ascii="Calibri" w:hAnsi="Calibri" w:eastAsia="Calibri"/>
+                <w:b/>
+                <w:color w:val="FFFFFF"/>
+                <w:sz w:val="16"/>
+              </w:rPr>
+              <w:t>23:00</w:t>
+            </w:r>
+          </w:p>
+        </w:tc>
+      </w:tr>
+      <w:tr>
+        <w:tc>
+          <w:tcPr>
+            <w:tcW w:type="dxa" w:w="1020"/>
+            <w:shd w:fill="E8F5E9" w:val="clear" w:color="auto"/>
+          </w:tcPr>
+          <w:p>
+            <w:pPr>
+              <w:jc w:val="center"/>
+            </w:pPr>
+            <w:r>
+              <w:rPr>
+                <w:rFonts w:ascii="Calibri" w:hAnsi="Calibri" w:eastAsia="Calibri"/>
+                <w:b w:val="0"/>
+                <w:color w:val="282828"/>
+                <w:sz w:val="18"/>
+              </w:rPr>
+              <w:t>0,60</w:t>
+            </w:r>
+          </w:p>
+        </w:tc>
+        <w:tc>
+          <w:tcPr>
+            <w:tcW w:type="dxa" w:w="1020"/>
+            <w:shd w:fill="E8F5E9" w:val="clear" w:color="auto"/>
+          </w:tcPr>
+          <w:p>
+            <w:pPr>
+              <w:jc w:val="center"/>
+            </w:pPr>
+            <w:r>
+              <w:rPr>
+                <w:rFonts w:ascii="Calibri" w:hAnsi="Calibri" w:eastAsia="Calibri"/>
+                <w:b w:val="0"/>
+                <w:color w:val="282828"/>
+                <w:sz w:val="18"/>
+              </w:rPr>
+              <w:t>2,90</w:t>
+            </w:r>
+          </w:p>
+        </w:tc>
+        <w:tc>
+          <w:tcPr>
+            <w:tcW w:type="dxa" w:w="1020"/>
+            <w:shd w:fill="E8F5E9" w:val="clear" w:color="auto"/>
+          </w:tcPr>
+          <w:p>
+            <w:pPr>
+              <w:jc w:val="center"/>
+            </w:pPr>
+            <w:r>
+              <w:rPr>
+                <w:rFonts w:ascii="Calibri" w:hAnsi="Calibri" w:eastAsia="Calibri"/>
+                <w:b w:val="0"/>
+                <w:color w:val="282828"/>
+                <w:sz w:val="18"/>
+              </w:rPr>
+              <w:t>5,50</w:t>
+            </w:r>
+          </w:p>
+        </w:tc>
+        <w:tc>
+          <w:tcPr>
+            <w:tcW w:type="dxa" w:w="1020"/>
+            <w:shd w:fill="E8F5E9" w:val="clear" w:color="auto"/>
+          </w:tcPr>
+          <w:p>
+            <w:pPr>
+              <w:jc w:val="center"/>
+            </w:pPr>
+            <w:r>
+              <w:rPr>
+                <w:rFonts w:ascii="Calibri" w:hAnsi="Calibri" w:eastAsia="Calibri"/>
+                <w:b w:val="0"/>
+                <w:color w:val="282828"/>
+                <w:sz w:val="18"/>
+              </w:rPr>
+              <w:t>2,60</w:t>
+            </w:r>
+          </w:p>
+        </w:tc>
+        <w:tc>
+          <w:tcPr>
+            <w:tcW w:type="dxa" w:w="1020"/>
+            <w:shd w:fill="E8F5E9" w:val="clear" w:color="auto"/>
+          </w:tcPr>
+          <w:p>
+            <w:pPr>
+              <w:jc w:val="center"/>
+            </w:pPr>
+            <w:r>
+              <w:rPr>
+                <w:rFonts w:ascii="Calibri" w:hAnsi="Calibri" w:eastAsia="Calibri"/>
+                <w:b w:val="0"/>
+                <w:color w:val="282828"/>
+                <w:sz w:val="18"/>
+              </w:rPr>
+              <w:t>0,90</w:t>
+            </w:r>
+          </w:p>
+        </w:tc>
+        <w:tc>
+          <w:tcPr>
+            <w:tcW w:type="dxa" w:w="1020"/>
+            <w:shd w:fill="FFFFFF" w:val="clear" w:color="auto"/>
+          </w:tcPr>
+          <w:p>
+            <w:pPr>
+              <w:jc w:val="center"/>
+            </w:pPr>
+            <w:r>
+              <w:rPr>
+                <w:rFonts w:ascii="Calibri" w:hAnsi="Calibri" w:eastAsia="Calibri"/>
+                <w:b w:val="0"/>
+                <w:color w:val="282828"/>
+                <w:sz w:val="18"/>
+              </w:rPr>
+              <w:t>0,00</w:t>
+            </w:r>
+          </w:p>
+        </w:tc>
+        <w:tc>
+          <w:tcPr>
+            <w:tcW w:type="dxa" w:w="1020"/>
+            <w:shd w:fill="FFFFFF" w:val="clear" w:color="auto"/>
+          </w:tcPr>
+          <w:p>
+            <w:pPr>
+              <w:jc w:val="center"/>
+            </w:pPr>
+            <w:r>
+              <w:rPr>
+                <w:rFonts w:ascii="Calibri" w:hAnsi="Calibri" w:eastAsia="Calibri"/>
+                <w:b w:val="0"/>
+                <w:color w:val="282828"/>
+                <w:sz w:val="18"/>
+              </w:rPr>
+              <w:t>0,00</w:t>
+            </w:r>
+          </w:p>
+        </w:tc>
+        <w:tc>
+          <w:tcPr>
+            <w:tcW w:type="dxa" w:w="1020"/>
+            <w:shd w:fill="FFFFFF" w:val="clear" w:color="auto"/>
+          </w:tcPr>
+          <w:p>
+            <w:pPr>
+              <w:jc w:val="center"/>
+            </w:pPr>
+            <w:r>
+              <w:rPr>
+                <w:rFonts w:ascii="Calibri" w:hAnsi="Calibri" w:eastAsia="Calibri"/>
+                <w:b w:val="0"/>
+                <w:color w:val="282828"/>
+                <w:sz w:val="18"/>
+              </w:rPr>
+              <w:t>0,00</w:t>
+            </w:r>
+          </w:p>
+        </w:tc>
+        <w:tc>
+          <w:tcPr>
+            <w:tcW w:type="dxa" w:w="1020"/>
+            <w:shd w:fill="FFFFFF" w:val="clear" w:color="auto"/>
+          </w:tcPr>
+          <w:p>
+            <w:pPr>
+              <w:jc w:val="center"/>
+            </w:pPr>
+            <w:r>
+              <w:rPr>
+                <w:rFonts w:ascii="Calibri" w:hAnsi="Calibri" w:eastAsia="Calibri"/>
+                <w:b w:val="0"/>
+                <w:color w:val="282828"/>
+                <w:sz w:val="18"/>
+              </w:rPr>
+              <w:t>0,00</w:t>
+            </w:r>
+          </w:p>
+        </w:tc>
+        <w:tc>
+          <w:tcPr>
+            <w:tcW w:type="dxa" w:w="1020"/>
+            <w:shd w:fill="FFFFFF" w:val="clear" w:color="auto"/>
+          </w:tcPr>
+          <w:p>
+            <w:pPr>
+              <w:jc w:val="center"/>
+            </w:pPr>
+            <w:r>
+              <w:rPr>
+                <w:rFonts w:ascii="Calibri" w:hAnsi="Calibri" w:eastAsia="Calibri"/>
+                <w:b w:val="0"/>
+                <w:color w:val="282828"/>
+                <w:sz w:val="18"/>
+              </w:rPr>
+              <w:t>0,00</w:t>
+            </w:r>
+          </w:p>
+        </w:tc>
+      </w:tr>
+    </w:tbl>
+    <w:p/>
+    <w:p>
+      <w:r>
+        <w:rPr>
+          <w:rFonts w:ascii="Calibri" w:hAnsi="Calibri" w:eastAsia="Calibri"/>
+          <w:b w:val="0"/>
+          <w:color w:val="646E78"/>
+          <w:sz w:val="20"/>
+        </w:rPr>
+        <w:t>Subtotal listado 22/09: 12,50 m³.</w:t>
       </w:r>
     </w:p>
     <w:tbl>
@@ -2593,7 +3047,7 @@
                 <w:color w:val="282828"/>
                 <w:sz w:val="20"/>
               </w:rPr>
-              <w:t>85,50 m³</w:t>
+              <w:t>78,10 m³</w:t>
             </w:r>
           </w:p>
         </w:tc>
@@ -2665,7 +3119,7 @@
                 <w:color w:val="1B5E20"/>
                 <w:sz w:val="20"/>
               </w:rPr>
-              <w:t>5.3 %</w:t>
+              <w:t>3.6 %</w:t>
             </w:r>
           </w:p>
         </w:tc>
@@ -2680,7 +3134,7 @@
           <w:color w:val="282828"/>
           <w:sz w:val="21"/>
         </w:rPr>
-        <w:t>Error Sensus vs app: 5.3% (1 − 81/85,50). Aceptable (diferencia moderada).</w:t>
+        <w:t>Error Sensus vs app: 3.6% (1 − 78,10/81). Aceptable.</w:t>
       </w:r>
     </w:p>
     <w:p>
@@ -2705,7 +3159,7 @@
           <w:color w:val="282828"/>
           <w:sz w:val="21"/>
         </w:rPr>
-        <w:t>Se confirma falla de memoria de placa (sensor y voltajes OK). Validación única 22–28/09: Sensus 81 m³ vs app 85,50 m³ (error 5.3%, Aceptable (diferencia moderada)). El agente IA revisará diariamente el caudal vs histórico y techo DN90 (60 m³/h).</w:t>
+        <w:t>Se confirma falla de memoria de placa (sensor y voltajes OK). Validación única 22–28/09: Sensus 81 m³ vs app 78,10 m³ (error 3.6%, Aceptable). El agente IA revisará diariamente el caudal vs histórico y techo DN90 (60 m³/h).</w:t>
       </w:r>
     </w:p>
     <w:p>
@@ -2719,7 +3173,7 @@
           <w:color w:val="646E78"/>
           <w:sz w:val="18"/>
         </w:rPr>
-        <w:t>WES · Informe final · Fundo Zapallar · 28-09-2026 18:55</w:t>
+        <w:t>WES · Informe final · Fundo Zapallar · 28-09-2026 18:59</w:t>
       </w:r>
     </w:p>
     <w:sectPr>

</xml_diff>

<commit_message>
Zapallar: girar fotos 28/09 y evitar tablas cortadas
Fotos del 28/09 orientadas para leer el odómetro (Matriz CCW90,
Etapa5 CW90). Tablas con cantSplit/keepNext y saltos de página
antes de §4 y §5. PDF regenerados y reenviados a Juan y Aníbal.

Co-authored-by: anibaloperacionesWes <anibaloperacionesWes@users.noreply.github.com>
</commit_message>
<xml_diff>
--- a/reports/Fundo_Zapallar/Informes_Tecnicos/validacion_22_28_out/Informe_Validacion_Etapa5_Zapallar_20260924_1136.docx
+++ b/reports/Fundo_Zapallar/Informes_Tecnicos/validacion_22_28_out/Informe_Validacion_Etapa5_Zapallar_20260924_1136.docx
@@ -1860,6 +1860,15 @@
     </w:p>
     <w:p>
       <w:r>
+        <w:br w:type="page"/>
+      </w:r>
+    </w:p>
+    <w:p>
+      <w:pPr>
+        <w:keepNext/>
+        <w:keepLines/>
+      </w:pPr>
+      <w:r>
         <w:rPr>
           <w:rFonts w:ascii="Calibri" w:hAnsi="Calibri" w:eastAsia="Calibri"/>
           <w:b/>
@@ -1870,6 +1879,10 @@
       </w:r>
     </w:p>
     <w:p>
+      <w:pPr>
+        <w:keepNext/>
+        <w:keepLines/>
+      </w:pPr>
       <w:r>
         <w:rPr>
           <w:rFonts w:ascii="Calibri" w:hAnsi="Calibri" w:eastAsia="Calibri"/>
@@ -1900,6 +1913,10 @@
         <w:gridCol w:w="3399"/>
       </w:tblGrid>
       <w:tr>
+        <w:trPr>
+          <w:cantSplit/>
+          <w:tblHeader w:val="true"/>
+        </w:trPr>
         <w:tc>
           <w:tcPr>
             <w:tcW w:type="dxa" w:w="3399"/>
@@ -1907,7 +1924,10 @@
           </w:tcPr>
           <w:p>
             <w:pPr>
-              <w:jc w:val="center"/>
+              <w:spacing w:before="0" w:after="20"/>
+              <w:jc w:val="center"/>
+              <w:keepNext/>
+              <w:keepLines/>
             </w:pPr>
             <w:r>
               <w:rPr>
@@ -1927,7 +1947,10 @@
           </w:tcPr>
           <w:p>
             <w:pPr>
-              <w:jc w:val="center"/>
+              <w:spacing w:before="0" w:after="20"/>
+              <w:jc w:val="center"/>
+              <w:keepNext/>
+              <w:keepLines/>
             </w:pPr>
             <w:r>
               <w:rPr>
@@ -1947,7 +1970,10 @@
           </w:tcPr>
           <w:p>
             <w:pPr>
-              <w:jc w:val="center"/>
+              <w:spacing w:before="0" w:after="20"/>
+              <w:jc w:val="center"/>
+              <w:keepNext/>
+              <w:keepLines/>
             </w:pPr>
             <w:r>
               <w:rPr>
@@ -1962,6 +1988,10 @@
         </w:tc>
       </w:tr>
       <w:tr>
+        <w:trPr>
+          <w:cantSplit/>
+          <w:tblHeader w:val="true"/>
+        </w:trPr>
         <w:tc>
           <w:tcPr>
             <w:tcW w:type="dxa" w:w="3399"/>
@@ -1969,7 +1999,9 @@
           </w:tcPr>
           <w:p>
             <w:pPr>
-              <w:jc w:val="center"/>
+              <w:spacing w:before="0" w:after="20"/>
+              <w:jc w:val="center"/>
+              <w:keepLines/>
             </w:pPr>
             <w:r>
               <w:rPr>
@@ -1999,7 +2031,9 @@
           </w:tcPr>
           <w:p>
             <w:pPr>
-              <w:jc w:val="center"/>
+              <w:spacing w:before="0" w:after="20"/>
+              <w:jc w:val="center"/>
+              <w:keepLines/>
             </w:pPr>
             <w:r>
               <w:rPr>
@@ -2029,7 +2063,9 @@
           </w:tcPr>
           <w:p>
             <w:pPr>
-              <w:jc w:val="center"/>
+              <w:spacing w:before="0" w:after="20"/>
+              <w:jc w:val="center"/>
+              <w:keepLines/>
             </w:pPr>
             <w:r>
               <w:rPr>
@@ -2056,6 +2092,10 @@
     </w:tbl>
     <w:p/>
     <w:p>
+      <w:pPr>
+        <w:keepNext/>
+        <w:keepLines/>
+      </w:pPr>
       <w:r>
         <w:rPr>
           <w:rFonts w:ascii="Calibri" w:hAnsi="Calibri" w:eastAsia="Calibri"/>
@@ -2067,6 +2107,10 @@
       </w:r>
     </w:p>
     <w:p>
+      <w:pPr>
+        <w:keepNext/>
+        <w:keepLines/>
+      </w:pPr>
       <w:r>
         <w:rPr>
           <w:rFonts w:ascii="Calibri" w:hAnsi="Calibri" w:eastAsia="Calibri"/>
@@ -2104,6 +2148,10 @@
         <w:gridCol w:w="1020"/>
       </w:tblGrid>
       <w:tr>
+        <w:trPr>
+          <w:cantSplit/>
+          <w:tblHeader w:val="true"/>
+        </w:trPr>
         <w:tc>
           <w:tcPr>
             <w:tcW w:type="dxa" w:w="1020"/>
@@ -2111,7 +2159,10 @@
           </w:tcPr>
           <w:p>
             <w:pPr>
-              <w:jc w:val="center"/>
+              <w:spacing w:before="0" w:after="20"/>
+              <w:jc w:val="center"/>
+              <w:keepNext/>
+              <w:keepLines/>
             </w:pPr>
             <w:r>
               <w:rPr>
@@ -2131,7 +2182,10 @@
           </w:tcPr>
           <w:p>
             <w:pPr>
-              <w:jc w:val="center"/>
+              <w:spacing w:before="0" w:after="20"/>
+              <w:jc w:val="center"/>
+              <w:keepNext/>
+              <w:keepLines/>
             </w:pPr>
             <w:r>
               <w:rPr>
@@ -2151,7 +2205,10 @@
           </w:tcPr>
           <w:p>
             <w:pPr>
-              <w:jc w:val="center"/>
+              <w:spacing w:before="0" w:after="20"/>
+              <w:jc w:val="center"/>
+              <w:keepNext/>
+              <w:keepLines/>
             </w:pPr>
             <w:r>
               <w:rPr>
@@ -2171,7 +2228,10 @@
           </w:tcPr>
           <w:p>
             <w:pPr>
-              <w:jc w:val="center"/>
+              <w:spacing w:before="0" w:after="20"/>
+              <w:jc w:val="center"/>
+              <w:keepNext/>
+              <w:keepLines/>
             </w:pPr>
             <w:r>
               <w:rPr>
@@ -2191,7 +2251,10 @@
           </w:tcPr>
           <w:p>
             <w:pPr>
-              <w:jc w:val="center"/>
+              <w:spacing w:before="0" w:after="20"/>
+              <w:jc w:val="center"/>
+              <w:keepNext/>
+              <w:keepLines/>
             </w:pPr>
             <w:r>
               <w:rPr>
@@ -2211,7 +2274,10 @@
           </w:tcPr>
           <w:p>
             <w:pPr>
-              <w:jc w:val="center"/>
+              <w:spacing w:before="0" w:after="20"/>
+              <w:jc w:val="center"/>
+              <w:keepNext/>
+              <w:keepLines/>
             </w:pPr>
             <w:r>
               <w:rPr>
@@ -2231,7 +2297,10 @@
           </w:tcPr>
           <w:p>
             <w:pPr>
-              <w:jc w:val="center"/>
+              <w:spacing w:before="0" w:after="20"/>
+              <w:jc w:val="center"/>
+              <w:keepNext/>
+              <w:keepLines/>
             </w:pPr>
             <w:r>
               <w:rPr>
@@ -2251,7 +2320,10 @@
           </w:tcPr>
           <w:p>
             <w:pPr>
-              <w:jc w:val="center"/>
+              <w:spacing w:before="0" w:after="20"/>
+              <w:jc w:val="center"/>
+              <w:keepNext/>
+              <w:keepLines/>
             </w:pPr>
             <w:r>
               <w:rPr>
@@ -2271,7 +2343,10 @@
           </w:tcPr>
           <w:p>
             <w:pPr>
-              <w:jc w:val="center"/>
+              <w:spacing w:before="0" w:after="20"/>
+              <w:jc w:val="center"/>
+              <w:keepNext/>
+              <w:keepLines/>
             </w:pPr>
             <w:r>
               <w:rPr>
@@ -2291,7 +2366,10 @@
           </w:tcPr>
           <w:p>
             <w:pPr>
-              <w:jc w:val="center"/>
+              <w:spacing w:before="0" w:after="20"/>
+              <w:jc w:val="center"/>
+              <w:keepNext/>
+              <w:keepLines/>
             </w:pPr>
             <w:r>
               <w:rPr>
@@ -2306,6 +2384,10 @@
         </w:tc>
       </w:tr>
       <w:tr>
+        <w:trPr>
+          <w:cantSplit/>
+          <w:tblHeader w:val="true"/>
+        </w:trPr>
         <w:tc>
           <w:tcPr>
             <w:tcW w:type="dxa" w:w="1020"/>
@@ -2313,7 +2395,9 @@
           </w:tcPr>
           <w:p>
             <w:pPr>
-              <w:jc w:val="center"/>
+              <w:spacing w:before="0" w:after="20"/>
+              <w:jc w:val="center"/>
+              <w:keepLines/>
             </w:pPr>
             <w:r>
               <w:rPr>
@@ -2333,7 +2417,9 @@
           </w:tcPr>
           <w:p>
             <w:pPr>
-              <w:jc w:val="center"/>
+              <w:spacing w:before="0" w:after="20"/>
+              <w:jc w:val="center"/>
+              <w:keepLines/>
             </w:pPr>
             <w:r>
               <w:rPr>
@@ -2353,7 +2439,9 @@
           </w:tcPr>
           <w:p>
             <w:pPr>
-              <w:jc w:val="center"/>
+              <w:spacing w:before="0" w:after="20"/>
+              <w:jc w:val="center"/>
+              <w:keepLines/>
             </w:pPr>
             <w:r>
               <w:rPr>
@@ -2373,7 +2461,9 @@
           </w:tcPr>
           <w:p>
             <w:pPr>
-              <w:jc w:val="center"/>
+              <w:spacing w:before="0" w:after="20"/>
+              <w:jc w:val="center"/>
+              <w:keepLines/>
             </w:pPr>
             <w:r>
               <w:rPr>
@@ -2393,7 +2483,9 @@
           </w:tcPr>
           <w:p>
             <w:pPr>
-              <w:jc w:val="center"/>
+              <w:spacing w:before="0" w:after="20"/>
+              <w:jc w:val="center"/>
+              <w:keepLines/>
             </w:pPr>
             <w:r>
               <w:rPr>
@@ -2413,7 +2505,9 @@
           </w:tcPr>
           <w:p>
             <w:pPr>
-              <w:jc w:val="center"/>
+              <w:spacing w:before="0" w:after="20"/>
+              <w:jc w:val="center"/>
+              <w:keepLines/>
             </w:pPr>
             <w:r>
               <w:rPr>
@@ -2433,7 +2527,9 @@
           </w:tcPr>
           <w:p>
             <w:pPr>
-              <w:jc w:val="center"/>
+              <w:spacing w:before="0" w:after="20"/>
+              <w:jc w:val="center"/>
+              <w:keepLines/>
             </w:pPr>
             <w:r>
               <w:rPr>
@@ -2453,7 +2549,9 @@
           </w:tcPr>
           <w:p>
             <w:pPr>
-              <w:jc w:val="center"/>
+              <w:spacing w:before="0" w:after="20"/>
+              <w:jc w:val="center"/>
+              <w:keepLines/>
             </w:pPr>
             <w:r>
               <w:rPr>
@@ -2473,7 +2571,9 @@
           </w:tcPr>
           <w:p>
             <w:pPr>
-              <w:jc w:val="center"/>
+              <w:spacing w:before="0" w:after="20"/>
+              <w:jc w:val="center"/>
+              <w:keepLines/>
             </w:pPr>
             <w:r>
               <w:rPr>
@@ -2493,7 +2593,9 @@
           </w:tcPr>
           <w:p>
             <w:pPr>
-              <w:jc w:val="center"/>
+              <w:spacing w:before="0" w:after="20"/>
+              <w:jc w:val="center"/>
+              <w:keepLines/>
             </w:pPr>
             <w:r>
               <w:rPr>
@@ -2510,6 +2612,10 @@
     </w:tbl>
     <w:p/>
     <w:p>
+      <w:pPr>
+        <w:keepNext/>
+        <w:keepLines/>
+      </w:pPr>
       <w:r>
         <w:rPr>
           <w:rFonts w:ascii="Calibri" w:hAnsi="Calibri" w:eastAsia="Calibri"/>
@@ -2539,6 +2645,10 @@
         <w:gridCol w:w="5098"/>
       </w:tblGrid>
       <w:tr>
+        <w:trPr>
+          <w:cantSplit/>
+          <w:tblHeader w:val="true"/>
+        </w:trPr>
         <w:tc>
           <w:tcPr>
             <w:tcW w:type="dxa" w:w="5098"/>
@@ -2546,12 +2656,15 @@
           </w:tcPr>
           <w:p>
             <w:pPr>
-              <w:jc w:val="center"/>
+              <w:spacing w:before="0" w:after="20"/>
+              <w:jc w:val="center"/>
+              <w:keepNext/>
+              <w:keepLines/>
             </w:pPr>
             <w:r>
               <w:drawing>
                 <wp:inline>
-                  <wp:extent cx="3063240" cy="3409519"/>
+                  <wp:extent cx="2743200" cy="3107531"/>
                   <wp:docPr id="1" name="Picture 1"/>
                   <wp:cNvGraphicFramePr>
                     <a:graphicFrameLocks noChangeAspect="1"/>
@@ -2572,7 +2685,7 @@
                         <pic:spPr>
                           <a:xfrm>
                             <a:off x="0" y="0"/>
-                            <a:ext cx="3063240" cy="3409519"/>
+                            <a:ext cx="2743200" cy="3107531"/>
                           </a:xfrm>
                           <a:prstGeom prst="rect"/>
                         </pic:spPr>
@@ -2591,12 +2704,15 @@
           </w:tcPr>
           <w:p>
             <w:pPr>
-              <w:jc w:val="center"/>
+              <w:spacing w:before="0" w:after="20"/>
+              <w:jc w:val="center"/>
+              <w:keepNext/>
+              <w:keepLines/>
             </w:pPr>
             <w:r>
               <w:drawing>
                 <wp:inline>
-                  <wp:extent cx="3063240" cy="3395900"/>
+                  <wp:extent cx="2743200" cy="1744910"/>
                   <wp:docPr id="2" name="Picture 2"/>
                   <wp:cNvGraphicFramePr>
                     <a:graphicFrameLocks noChangeAspect="1"/>
@@ -2617,7 +2733,7 @@
                         <pic:spPr>
                           <a:xfrm>
                             <a:off x="0" y="0"/>
-                            <a:ext cx="3063240" cy="3395900"/>
+                            <a:ext cx="2743200" cy="1744910"/>
                           </a:xfrm>
                           <a:prstGeom prst="rect"/>
                         </pic:spPr>
@@ -2631,6 +2747,10 @@
         </w:tc>
       </w:tr>
       <w:tr>
+        <w:trPr>
+          <w:cantSplit/>
+          <w:tblHeader w:val="true"/>
+        </w:trPr>
         <w:tc>
           <w:tcPr>
             <w:tcW w:type="dxa" w:w="5098"/>
@@ -2638,7 +2758,9 @@
           </w:tcPr>
           <w:p>
             <w:pPr>
-              <w:jc w:val="center"/>
+              <w:spacing w:before="0" w:after="20"/>
+              <w:jc w:val="center"/>
+              <w:keepLines/>
             </w:pPr>
             <w:r>
               <w:rPr>
@@ -2658,7 +2780,9 @@
           </w:tcPr>
           <w:p>
             <w:pPr>
-              <w:jc w:val="center"/>
+              <w:spacing w:before="0" w:after="20"/>
+              <w:jc w:val="center"/>
+              <w:keepLines/>
             </w:pPr>
             <w:r>
               <w:rPr>
@@ -2675,6 +2799,10 @@
     </w:tbl>
     <w:p/>
     <w:p>
+      <w:pPr>
+        <w:keepNext/>
+        <w:keepLines/>
+      </w:pPr>
       <w:r>
         <w:rPr>
           <w:rFonts w:ascii="Calibri" w:hAnsi="Calibri" w:eastAsia="Calibri"/>
@@ -2709,6 +2837,10 @@
         <w:gridCol w:w="1457"/>
       </w:tblGrid>
       <w:tr>
+        <w:trPr>
+          <w:cantSplit/>
+          <w:tblHeader w:val="true"/>
+        </w:trPr>
         <w:tc>
           <w:tcPr>
             <w:tcW w:type="dxa" w:w="1457"/>
@@ -2716,7 +2848,10 @@
           </w:tcPr>
           <w:p>
             <w:pPr>
-              <w:jc w:val="center"/>
+              <w:spacing w:before="0" w:after="20"/>
+              <w:jc w:val="center"/>
+              <w:keepNext/>
+              <w:keepLines/>
             </w:pPr>
             <w:r>
               <w:rPr>
@@ -2736,7 +2871,10 @@
           </w:tcPr>
           <w:p>
             <w:pPr>
-              <w:jc w:val="center"/>
+              <w:spacing w:before="0" w:after="20"/>
+              <w:jc w:val="center"/>
+              <w:keepNext/>
+              <w:keepLines/>
             </w:pPr>
             <w:r>
               <w:rPr>
@@ -2756,7 +2894,10 @@
           </w:tcPr>
           <w:p>
             <w:pPr>
-              <w:jc w:val="center"/>
+              <w:spacing w:before="0" w:after="20"/>
+              <w:jc w:val="center"/>
+              <w:keepNext/>
+              <w:keepLines/>
             </w:pPr>
             <w:r>
               <w:rPr>
@@ -2776,7 +2917,10 @@
           </w:tcPr>
           <w:p>
             <w:pPr>
-              <w:jc w:val="center"/>
+              <w:spacing w:before="0" w:after="20"/>
+              <w:jc w:val="center"/>
+              <w:keepNext/>
+              <w:keepLines/>
             </w:pPr>
             <w:r>
               <w:rPr>
@@ -2796,7 +2940,10 @@
           </w:tcPr>
           <w:p>
             <w:pPr>
-              <w:jc w:val="center"/>
+              <w:spacing w:before="0" w:after="20"/>
+              <w:jc w:val="center"/>
+              <w:keepNext/>
+              <w:keepLines/>
             </w:pPr>
             <w:r>
               <w:rPr>
@@ -2816,7 +2963,10 @@
           </w:tcPr>
           <w:p>
             <w:pPr>
-              <w:jc w:val="center"/>
+              <w:spacing w:before="0" w:after="20"/>
+              <w:jc w:val="center"/>
+              <w:keepNext/>
+              <w:keepLines/>
             </w:pPr>
             <w:r>
               <w:rPr>
@@ -2836,7 +2986,10 @@
           </w:tcPr>
           <w:p>
             <w:pPr>
-              <w:jc w:val="center"/>
+              <w:spacing w:before="0" w:after="20"/>
+              <w:jc w:val="center"/>
+              <w:keepNext/>
+              <w:keepLines/>
             </w:pPr>
             <w:r>
               <w:rPr>
@@ -2851,6 +3004,10 @@
         </w:tc>
       </w:tr>
       <w:tr>
+        <w:trPr>
+          <w:cantSplit/>
+          <w:tblHeader w:val="true"/>
+        </w:trPr>
         <w:tc>
           <w:tcPr>
             <w:tcW w:type="dxa" w:w="1457"/>
@@ -2858,7 +3015,9 @@
           </w:tcPr>
           <w:p>
             <w:pPr>
-              <w:jc w:val="center"/>
+              <w:spacing w:before="0" w:after="20"/>
+              <w:jc w:val="center"/>
+              <w:keepLines/>
             </w:pPr>
             <w:r>
               <w:rPr>
@@ -2878,7 +3037,9 @@
           </w:tcPr>
           <w:p>
             <w:pPr>
-              <w:jc w:val="center"/>
+              <w:spacing w:before="0" w:after="20"/>
+              <w:jc w:val="center"/>
+              <w:keepLines/>
             </w:pPr>
             <w:r>
               <w:rPr>
@@ -2900,7 +3061,9 @@
           </w:tcPr>
           <w:p>
             <w:pPr>
-              <w:jc w:val="center"/>
+              <w:spacing w:before="0" w:after="20"/>
+              <w:jc w:val="center"/>
+              <w:keepLines/>
             </w:pPr>
             <w:r>
               <w:rPr>
@@ -2920,7 +3083,9 @@
           </w:tcPr>
           <w:p>
             <w:pPr>
-              <w:jc w:val="center"/>
+              <w:spacing w:before="0" w:after="20"/>
+              <w:jc w:val="center"/>
+              <w:keepLines/>
             </w:pPr>
             <w:r>
               <w:rPr>
@@ -2942,7 +3107,9 @@
           </w:tcPr>
           <w:p>
             <w:pPr>
-              <w:jc w:val="center"/>
+              <w:spacing w:before="0" w:after="20"/>
+              <w:jc w:val="center"/>
+              <w:keepLines/>
             </w:pPr>
             <w:r>
               <w:rPr>
@@ -2962,7 +3129,9 @@
           </w:tcPr>
           <w:p>
             <w:pPr>
-              <w:jc w:val="center"/>
+              <w:spacing w:before="0" w:after="20"/>
+              <w:jc w:val="center"/>
+              <w:keepLines/>
             </w:pPr>
             <w:r>
               <w:rPr>
@@ -2982,7 +3151,9 @@
           </w:tcPr>
           <w:p>
             <w:pPr>
-              <w:jc w:val="center"/>
+              <w:spacing w:before="0" w:after="20"/>
+              <w:jc w:val="center"/>
+              <w:keepLines/>
             </w:pPr>
             <w:r>
               <w:rPr>
@@ -2997,7 +3168,12 @@
         </w:tc>
       </w:tr>
     </w:tbl>
-    <w:p/>
+    <w:p>
+      <w:pPr>
+        <w:keepNext/>
+        <w:keepLines/>
+      </w:pPr>
+    </w:p>
     <w:tbl>
       <w:tblPr>
         <w:tblW w:type="auto" w:w="0"/>
@@ -3017,12 +3193,21 @@
         <w:gridCol w:w="5098"/>
       </w:tblGrid>
       <w:tr>
+        <w:trPr>
+          <w:cantSplit/>
+          <w:tblHeader w:val="true"/>
+        </w:trPr>
         <w:tc>
           <w:tcPr>
             <w:tcW w:type="dxa" w:w="5098"/>
             <w:shd w:fill="FFFFFF" w:val="clear" w:color="auto"/>
           </w:tcPr>
           <w:p>
+            <w:pPr>
+              <w:spacing w:before="0" w:after="20"/>
+              <w:keepNext/>
+              <w:keepLines/>
+            </w:pPr>
             <w:r>
               <w:rPr>
                 <w:rFonts w:ascii="Calibri" w:hAnsi="Calibri" w:eastAsia="Calibri"/>
@@ -3040,6 +3225,11 @@
             <w:shd w:fill="FFFFFF" w:val="clear" w:color="auto"/>
           </w:tcPr>
           <w:p>
+            <w:pPr>
+              <w:spacing w:before="0" w:after="20"/>
+              <w:keepNext/>
+              <w:keepLines/>
+            </w:pPr>
             <w:r>
               <w:rPr>
                 <w:rFonts w:ascii="Calibri" w:hAnsi="Calibri" w:eastAsia="Calibri"/>
@@ -3053,12 +3243,21 @@
         </w:tc>
       </w:tr>
       <w:tr>
+        <w:trPr>
+          <w:cantSplit/>
+          <w:tblHeader w:val="true"/>
+        </w:trPr>
         <w:tc>
           <w:tcPr>
             <w:tcW w:type="dxa" w:w="5098"/>
             <w:shd w:fill="F5F8FB" w:val="clear" w:color="auto"/>
           </w:tcPr>
           <w:p>
+            <w:pPr>
+              <w:spacing w:before="0" w:after="20"/>
+              <w:keepNext/>
+              <w:keepLines/>
+            </w:pPr>
             <w:r>
               <w:rPr>
                 <w:rFonts w:ascii="Calibri" w:hAnsi="Calibri" w:eastAsia="Calibri"/>
@@ -3076,6 +3275,11 @@
             <w:shd w:fill="F5F8FB" w:val="clear" w:color="auto"/>
           </w:tcPr>
           <w:p>
+            <w:pPr>
+              <w:spacing w:before="0" w:after="20"/>
+              <w:keepNext/>
+              <w:keepLines/>
+            </w:pPr>
             <w:r>
               <w:rPr>
                 <w:rFonts w:ascii="Calibri" w:hAnsi="Calibri" w:eastAsia="Calibri"/>
@@ -3089,12 +3293,20 @@
         </w:tc>
       </w:tr>
       <w:tr>
+        <w:trPr>
+          <w:cantSplit/>
+          <w:tblHeader w:val="true"/>
+        </w:trPr>
         <w:tc>
           <w:tcPr>
             <w:tcW w:type="dxa" w:w="5098"/>
             <w:shd w:fill="E8F5E9" w:val="clear" w:color="auto"/>
           </w:tcPr>
           <w:p>
+            <w:pPr>
+              <w:spacing w:before="0" w:after="20"/>
+              <w:keepLines/>
+            </w:pPr>
             <w:r>
               <w:rPr>
                 <w:rFonts w:ascii="Calibri" w:hAnsi="Calibri" w:eastAsia="Calibri"/>
@@ -3112,6 +3324,10 @@
             <w:shd w:fill="E8F5E9" w:val="clear" w:color="auto"/>
           </w:tcPr>
           <w:p>
+            <w:pPr>
+              <w:spacing w:before="0" w:after="20"/>
+              <w:keepLines/>
+            </w:pPr>
             <w:r>
               <w:rPr>
                 <w:rFonts w:ascii="Calibri" w:hAnsi="Calibri" w:eastAsia="Calibri"/>
@@ -3138,9 +3354,11 @@
       </w:r>
     </w:p>
     <w:p>
-      <w:pPr>
-        <w:spacing w:before="200"/>
-      </w:pPr>
+      <w:r>
+        <w:br w:type="page"/>
+      </w:r>
+    </w:p>
+    <w:p>
       <w:r>
         <w:rPr>
           <w:rFonts w:ascii="Calibri" w:hAnsi="Calibri" w:eastAsia="Calibri"/>
@@ -3173,7 +3391,7 @@
           <w:color w:val="646E78"/>
           <w:sz w:val="18"/>
         </w:rPr>
-        <w:t>WES · Informe final · Fundo Zapallar · 28-09-2026 18:59</w:t>
+        <w:t>WES · Informe final · Fundo Zapallar · 28-09-2026 19:20</w:t>
       </w:r>
     </w:p>
     <w:sectPr>

</xml_diff>

<commit_message>
Fix tablas partidas y fotos con odómetro de frente
PDF vía LibreOffice (Google Docs partía filas pese a cantSplit).
Salto de página antes de tablas §3; fotos 22/28 orientadas con
números de frente al lector. Reenviado a Juan y Aníbal.

Co-authored-by: anibaloperacionesWes <anibaloperacionesWes@users.noreply.github.com>
</commit_message>
<xml_diff>
--- a/reports/Fundo_Zapallar/Informes_Tecnicos/validacion_22_28_out/Informe_Validacion_Etapa5_Zapallar_20260924_1136.docx
+++ b/reports/Fundo_Zapallar/Informes_Tecnicos/validacion_22_28_out/Informe_Validacion_Etapa5_Zapallar_20260924_1136.docx
@@ -210,7 +210,7 @@
                 <w:between w:space="0" w:sz="0" w:val="nil"/>
               </w:pBdr>
               <w:shd w:fill="auto" w:val="clear"/>
-              <w:spacing w:after="0" w:before="0" w:line="240" w:lineRule="auto"/>
+              <w:spacing w:after="20" w:before="0" w:line="240" w:lineRule="auto"/>
               <w:ind w:left="127.28004455566406" w:right="0" w:firstLine="0"/>
               <w:jc w:val="center"/>
               <w:rPr>
@@ -265,7 +265,7 @@
                 <w:between w:space="0" w:sz="0" w:val="nil"/>
               </w:pBdr>
               <w:shd w:fill="auto" w:val="clear"/>
-              <w:spacing w:after="0" w:before="0" w:line="240" w:lineRule="auto"/>
+              <w:spacing w:after="20" w:before="0" w:line="240" w:lineRule="auto"/>
               <w:ind w:left="135.19989013671875" w:right="0" w:firstLine="0"/>
               <w:jc w:val="center"/>
               <w:rPr>
@@ -320,7 +320,7 @@
                 <w:between w:space="0" w:sz="0" w:val="nil"/>
               </w:pBdr>
               <w:shd w:fill="auto" w:val="clear"/>
-              <w:spacing w:after="0" w:before="0" w:line="240" w:lineRule="auto"/>
+              <w:spacing w:after="20" w:before="0" w:line="240" w:lineRule="auto"/>
               <w:ind w:left="135.1995849609375" w:right="0" w:firstLine="0"/>
               <w:jc w:val="center"/>
               <w:rPr>
@@ -382,7 +382,7 @@
                 <w:between w:space="0" w:sz="0" w:val="nil"/>
               </w:pBdr>
               <w:shd w:fill="auto" w:val="clear"/>
-              <w:spacing w:after="0" w:before="0" w:line="240" w:lineRule="auto"/>
+              <w:spacing w:after="20" w:before="0" w:line="240" w:lineRule="auto"/>
               <w:ind w:left="140.6000518798828" w:right="0" w:firstLine="0"/>
               <w:jc w:val="center"/>
               <w:rPr>
@@ -447,7 +447,7 @@
                 <w:between w:space="0" w:sz="0" w:val="nil"/>
               </w:pBdr>
               <w:shd w:fill="auto" w:val="clear"/>
-              <w:spacing w:after="0" w:before="0" w:line="240" w:lineRule="auto"/>
+              <w:spacing w:after="20" w:before="0" w:line="240" w:lineRule="auto"/>
               <w:ind w:left="130.7598876953125" w:right="0" w:firstLine="0"/>
               <w:jc w:val="center"/>
               <w:rPr>
@@ -512,7 +512,7 @@
                 <w:between w:space="0" w:sz="0" w:val="nil"/>
               </w:pBdr>
               <w:shd w:fill="auto" w:val="clear"/>
-              <w:spacing w:after="0" w:before="0" w:line="294.0493869781494" w:lineRule="auto"/>
+              <w:spacing w:after="20" w:before="0" w:line="294.0493869781494" w:lineRule="auto"/>
               <w:ind w:left="128.759765625" w:right="480.6005859375" w:firstLine="11.839599609375"/>
               <w:jc w:val="center"/>
               <w:rPr>
@@ -1262,7 +1262,7 @@
                 <w:between w:space="0" w:sz="0" w:val="nil"/>
               </w:pBdr>
               <w:shd w:fill="auto" w:val="clear"/>
-              <w:spacing w:after="0" w:before="0" w:line="240" w:lineRule="auto"/>
+              <w:spacing w:after="20" w:before="0" w:line="240" w:lineRule="auto"/>
               <w:ind w:left="119.00001525878906" w:right="0" w:firstLine="0"/>
               <w:jc w:val="left"/>
               <w:rPr>
@@ -1327,7 +1327,7 @@
                 <w:between w:space="0" w:sz="0" w:val="nil"/>
               </w:pBdr>
               <w:shd w:fill="auto" w:val="clear"/>
-              <w:spacing w:after="0" w:before="0" w:line="240" w:lineRule="auto"/>
+              <w:spacing w:after="20" w:before="0" w:line="240" w:lineRule="auto"/>
               <w:ind w:left="130.4400634765625" w:right="0" w:firstLine="0"/>
               <w:jc w:val="left"/>
               <w:rPr>
@@ -1399,7 +1399,7 @@
                 <w:between w:space="0" w:sz="0" w:val="nil"/>
               </w:pBdr>
               <w:shd w:fill="auto" w:val="clear"/>
-              <w:spacing w:after="0" w:before="0" w:line="240" w:lineRule="auto"/>
+              <w:spacing w:after="20" w:before="0" w:line="240" w:lineRule="auto"/>
               <w:ind w:left="136.8000030517578" w:right="0" w:firstLine="0"/>
               <w:jc w:val="left"/>
               <w:rPr>
@@ -1464,7 +1464,7 @@
                 <w:between w:space="0" w:sz="0" w:val="nil"/>
               </w:pBdr>
               <w:shd w:fill="auto" w:val="clear"/>
-              <w:spacing w:after="0" w:before="0" w:line="240" w:lineRule="auto"/>
+              <w:spacing w:after="20" w:before="0" w:line="240" w:lineRule="auto"/>
               <w:ind w:left="141.199951171875" w:right="0" w:firstLine="0"/>
               <w:jc w:val="left"/>
               <w:rPr>
@@ -1536,7 +1536,7 @@
                 <w:between w:space="0" w:sz="0" w:val="nil"/>
               </w:pBdr>
               <w:shd w:fill="auto" w:val="clear"/>
-              <w:spacing w:after="0" w:before="0" w:line="240" w:lineRule="auto"/>
+              <w:spacing w:after="20" w:before="0" w:line="240" w:lineRule="auto"/>
               <w:ind w:left="128.60000610351562" w:right="0" w:firstLine="0"/>
               <w:jc w:val="left"/>
               <w:rPr>
@@ -1601,7 +1601,7 @@
                 <w:between w:space="0" w:sz="0" w:val="nil"/>
               </w:pBdr>
               <w:shd w:fill="auto" w:val="clear"/>
-              <w:spacing w:after="0" w:before="0" w:line="240" w:lineRule="auto"/>
+              <w:spacing w:after="20" w:before="0" w:line="240" w:lineRule="auto"/>
               <w:ind w:left="141.199951171875" w:right="0" w:firstLine="0"/>
               <w:jc w:val="left"/>
               <w:rPr>
@@ -1673,7 +1673,7 @@
                 <w:between w:space="0" w:sz="0" w:val="nil"/>
               </w:pBdr>
               <w:shd w:fill="auto" w:val="clear"/>
-              <w:spacing w:after="0" w:before="0" w:line="240" w:lineRule="auto"/>
+              <w:spacing w:after="20" w:before="0" w:line="240" w:lineRule="auto"/>
               <w:ind w:left="128.60000610351562" w:right="0" w:firstLine="0"/>
               <w:jc w:val="left"/>
               <w:rPr>
@@ -1738,7 +1738,7 @@
                 <w:between w:space="0" w:sz="0" w:val="nil"/>
               </w:pBdr>
               <w:shd w:fill="auto" w:val="clear"/>
-              <w:spacing w:after="0" w:before="0" w:line="240" w:lineRule="auto"/>
+              <w:spacing w:after="20" w:before="0" w:line="240" w:lineRule="auto"/>
               <w:ind w:left="141.199951171875" w:right="0" w:firstLine="0"/>
               <w:jc w:val="left"/>
               <w:rPr>
@@ -2712,7 +2712,7 @@
             <w:r>
               <w:drawing>
                 <wp:inline>
-                  <wp:extent cx="2743200" cy="1744910"/>
+                  <wp:extent cx="2743200" cy="3112692"/>
                   <wp:docPr id="2" name="Picture 2"/>
                   <wp:cNvGraphicFramePr>
                     <a:graphicFrameLocks noChangeAspect="1"/>
@@ -2733,7 +2733,7 @@
                         <pic:spPr>
                           <a:xfrm>
                             <a:off x="0" y="0"/>
-                            <a:ext cx="2743200" cy="1744910"/>
+                            <a:ext cx="2743200" cy="3112692"/>
                           </a:xfrm>
                           <a:prstGeom prst="rect"/>
                         </pic:spPr>
@@ -3391,7 +3391,7 @@
           <w:color w:val="646E78"/>
           <w:sz w:val="18"/>
         </w:rPr>
-        <w:t>WES · Informe final · Fundo Zapallar · 28-09-2026 19:22</w:t>
+        <w:t>WES · Informe final · Fundo Zapallar · 28-09-2026 19:39</w:t>
       </w:r>
     </w:p>
     <w:sectPr>

</xml_diff>